<commit_message>
Phase 1 scaffolding: install, launchd, backup/restore, Tailscale, setup guide
PRD v0.2 records decisions: no admin chat reading, Infomaniak provisional,
backups on the Mac.

Co-Authored-By: Claude Sonnet 5.5 <noreply@anthropic.com>
Claude-Session: https://claude.ai/code/session_01Qs56CyPwtQAdyeiDNLqDfK
</commit_message>
<xml_diff>
--- a/docs/family-ai-hub-prd.docx
+++ b/docs/family-ai-hub-prd.docx
@@ -19,7 +19,7 @@
           <w:i/>
           <w:iCs/>
         </w:rPr>
-        <w:t xml:space="preserve">Product Requirements Document, draft v0.1</w:t>
+        <w:t xml:space="preserve">Product Requirements Document, draft v0.2</w:t>
       </w:r>
     </w:p>
     <w:p>
@@ -1453,7 +1453,7 @@
                 <w:sz w:val="20"/>
                 <w:szCs w:val="20"/>
               </w:rPr>
-              <w:t xml:space="preserve">Infomaniak (first approved provider, per owner decision).</w:t>
+              <w:t xml:space="preserve">Infomaniak (first approved provider, per owner decision; provisional until the terms are read, review by 10 Nov 2026).</w:t>
             </w:r>
           </w:p>
         </w:tc>
@@ -2137,7 +2137,7 @@
         <w:spacing w:after="60"/>
       </w:pPr>
       <w:r>
-        <w:t xml:space="preserve">Transparency over surveillance: agree as a family what, if anything, parents can see, and tell Grace plainly. Suggested starting point is that no chat content is read by default.</w:t>
+        <w:t xml:space="preserve">No chat content is read by the admin (owner decision, 10 Oct 2026). Tell Grace plainly. If that policy ever changes, it should change openly and in writing.</w:t>
       </w:r>
     </w:p>
     <w:p>
@@ -2824,59 +2824,114 @@
         <w:pStyle w:val="Heading1"/>
       </w:pPr>
       <w:r>
-        <w:t xml:space="preserve">10. Open questions</w:t>
-      </w:r>
-    </w:p>
-    <w:p>
-      <w:pPr>
-        <w:pStyle w:val="ListParagraph"/>
-        <w:numPr>
-          <w:ilvl w:val="0"/>
-          <w:numId w:val="2"/>
-        </w:numPr>
-        <w:spacing w:after="60"/>
-      </w:pPr>
-      <w:r>
-        <w:t xml:space="preserve">Oversight policy: what, if anything, may the admin read, particularly for Grace?</w:t>
-      </w:r>
-    </w:p>
-    <w:p>
-      <w:pPr>
-        <w:pStyle w:val="ListParagraph"/>
-        <w:numPr>
-          <w:ilvl w:val="0"/>
-          <w:numId w:val="2"/>
-        </w:numPr>
-        <w:spacing w:after="60"/>
-      </w:pPr>
-      <w:r>
-        <w:t xml:space="preserve">Which Infomaniak plan and models will be used, and where is the written confirmation of their data terms recorded?</w:t>
-      </w:r>
-    </w:p>
-    <w:p>
-      <w:pPr>
-        <w:pStyle w:val="ListParagraph"/>
-        <w:numPr>
-          <w:ilvl w:val="0"/>
-          <w:numId w:val="2"/>
-        </w:numPr>
-        <w:spacing w:after="60"/>
-      </w:pPr>
-      <w:r>
-        <w:t xml:space="preserve">Does the Mac need to be reachable when the family travels, and is it always on and plugged in?</w:t>
-      </w:r>
-    </w:p>
-    <w:p>
-      <w:pPr>
-        <w:pStyle w:val="ListParagraph"/>
-        <w:numPr>
-          <w:ilvl w:val="0"/>
-          <w:numId w:val="2"/>
-        </w:numPr>
-        <w:spacing w:after="60"/>
-      </w:pPr>
-      <w:r>
-        <w:t xml:space="preserve">Backup destination: external drive, a second family machine, or an encrypted offsite copy?</w:t>
+        <w:t xml:space="preserve">10. Decisions and open questions</w:t>
+      </w:r>
+    </w:p>
+    <w:p>
+      <w:pPr>
+        <w:spacing w:after="120"/>
+      </w:pPr>
+      <w:r>
+        <w:t xml:space="preserve">Decided on 10 October 2026</w:t>
+      </w:r>
+    </w:p>
+    <w:p>
+      <w:pPr>
+        <w:pStyle w:val="ListParagraph"/>
+        <w:numPr>
+          <w:ilvl w:val="0"/>
+          <w:numId w:val="2"/>
+        </w:numPr>
+        <w:spacing w:after="60"/>
+      </w:pPr>
+      <w:r>
+        <w:t xml:space="preserve">Admin does not read chats, including Grace’s.</w:t>
+      </w:r>
+    </w:p>
+    <w:p>
+      <w:pPr>
+        <w:pStyle w:val="ListParagraph"/>
+        <w:numPr>
+          <w:ilvl w:val="0"/>
+          <w:numId w:val="2"/>
+        </w:numPr>
+        <w:spacing w:after="60"/>
+      </w:pPr>
+      <w:r>
+        <w:t xml:space="preserve">Infomaniak is treated as approved on a provisional basis. The owner has an API key and will locate and record the written terms; until then the registry marks it provisional with a review date.</w:t>
+      </w:r>
+    </w:p>
+    <w:p>
+      <w:pPr>
+        <w:pStyle w:val="ListParagraph"/>
+        <w:numPr>
+          <w:ilvl w:val="0"/>
+          <w:numId w:val="2"/>
+        </w:numPr>
+        <w:spacing w:after="60"/>
+      </w:pPr>
+      <w:r>
+        <w:t xml:space="preserve">The Mac stays on and plugged in, including while the owner travels.</w:t>
+      </w:r>
+    </w:p>
+    <w:p>
+      <w:pPr>
+        <w:pStyle w:val="ListParagraph"/>
+        <w:numPr>
+          <w:ilvl w:val="0"/>
+          <w:numId w:val="2"/>
+        </w:numPr>
+        <w:spacing w:after="60"/>
+      </w:pPr>
+      <w:r>
+        <w:t xml:space="preserve">Backups are stored on the Mac itself. See the setup guide for a recommended configuration and its limits.</w:t>
+      </w:r>
+    </w:p>
+    <w:p>
+      <w:pPr>
+        <w:spacing w:after="120"/>
+      </w:pPr>
+      <w:r>
+        <w:t xml:space="preserve">Still open</w:t>
+      </w:r>
+    </w:p>
+    <w:p>
+      <w:pPr>
+        <w:pStyle w:val="ListParagraph"/>
+        <w:numPr>
+          <w:ilvl w:val="0"/>
+          <w:numId w:val="2"/>
+        </w:numPr>
+        <w:spacing w:after="60"/>
+      </w:pPr>
+      <w:r>
+        <w:t xml:space="preserve">Which Infomaniak plan and models will be used, and where the written terms are recorded.</w:t>
+      </w:r>
+    </w:p>
+    <w:p>
+      <w:pPr>
+        <w:pStyle w:val="ListParagraph"/>
+        <w:numPr>
+          <w:ilvl w:val="0"/>
+          <w:numId w:val="2"/>
+        </w:numPr>
+        <w:spacing w:after="60"/>
+      </w:pPr>
+      <w:r>
+        <w:t xml:space="preserve">Which external drive will hold backups, and who holds a second copy, if anyone.</w:t>
+      </w:r>
+    </w:p>
+    <w:p>
+      <w:pPr>
+        <w:pStyle w:val="ListParagraph"/>
+        <w:numPr>
+          <w:ilvl w:val="0"/>
+          <w:numId w:val="2"/>
+        </w:numPr>
+        <w:spacing w:after="60"/>
+      </w:pPr>
+      <w:r>
+        <w:t xml:space="preserve">Whether existing Open WebUI data on the Mac should be kept or the install started fresh.</w:t>
       </w:r>
     </w:p>
     <w:p>

</xml_diff>

<commit_message>
Docs: reflect real install (Docker migration, permissions, Grace, port 10000); add Study Buddy prompt
Co-Authored-By: Claude Sonnet 5.5 <noreply@anthropic.com>
Claude-Session: https://claude.ai/code/session_01Qs56CyPwtQAdyeiDNLqDfK
</commit_message>
<xml_diff>
--- a/docs/family-ai-hub-prd.docx
+++ b/docs/family-ai-hub-prd.docx
@@ -19,7 +19,7 @@
           <w:i/>
           <w:iCs/>
         </w:rPr>
-        <w:t xml:space="preserve">Product Requirements Document, draft v0.2</w:t>
+        <w:t xml:space="preserve">Product Requirements Document, draft v0.3</w:t>
       </w:r>
     </w:p>
     <w:p>
@@ -533,7 +533,7 @@
                 <w:sz w:val="20"/>
                 <w:szCs w:val="20"/>
               </w:rPr>
-              <w:t xml:space="preserve">Only sees models and assistants the admin has approved. Local models only at first. Cannot share, import tools, or change model settings. See section 7.</w:t>
+              <w:t xml:space="preserve">Only sees models the admin has approved, local only at first. Can create her own assistants. No tools, no public sharing. See section 7.</w:t>
             </w:r>
           </w:p>
         </w:tc>
@@ -2111,6 +2111,19 @@
         <w:spacing w:after="60"/>
       </w:pPr>
       <w:r>
+        <w:t xml:space="preserve">Decision (10 Oct 2026): Grace may create her own private assistants and share them with named people. Public sharing stays off for everyone. Her starting point is a Study Buddy assistant.</w:t>
+      </w:r>
+    </w:p>
+    <w:p>
+      <w:pPr>
+        <w:pStyle w:val="ListParagraph"/>
+        <w:numPr>
+          <w:ilvl w:val="0"/>
+          <w:numId w:val="2"/>
+        </w:numPr>
+        <w:spacing w:after="60"/>
+      </w:pPr>
+      <w:r>
         <w:t xml:space="preserve">Default system prompt appropriate for a young teen: age-appropriate content, encourages learning rather than doing homework for her, points to a trusted adult for sensitive topics.</w:t>
       </w:r>
     </w:p>
@@ -2124,7 +2137,7 @@
         <w:spacing w:after="60"/>
       </w:pPr>
       <w:r>
-        <w:t xml:space="preserve">No tool access, no sharing, no importing of community assistants or plugins.</w:t>
+        <w:t xml:space="preserve">No tool access and no public sharing or community assistants or plugins. Web search stays off until a provider is chosen on purpose.</w:t>
       </w:r>
     </w:p>
     <w:p>

</xml_diff>

<commit_message>
Docs: record phase 2 decisions (strip tools for cloud models, assistant model pipe) and cloud-model cautions
Co-Authored-By: Claude Sonnet 5.5 <noreply@anthropic.com>
Claude-Session: https://claude.ai/code/session_01Qs56CyPwtQAdyeiDNLqDfK
</commit_message>
<xml_diff>
--- a/docs/family-ai-hub-prd.docx
+++ b/docs/family-ai-hub-prd.docx
@@ -19,7 +19,7 @@
           <w:i/>
           <w:iCs/>
         </w:rPr>
-        <w:t xml:space="preserve">Product Requirements Document, draft v0.3</w:t>
+        <w:t xml:space="preserve">Product Requirements Document, draft v0.4</w:t>
       </w:r>
     </w:p>
     <w:p>
@@ -2423,7 +2423,7 @@
                 <w:sz w:val="20"/>
                 <w:szCs w:val="20"/>
               </w:rPr>
-              <w:t xml:space="preserve">Gateway service, provider registry with trust tiers, Infomaniak connected as approved, routing rules and audit log, resolve the design question in section 5.</w:t>
+              <w:t xml:space="preserve">Gateway service, provider registry with trust tiers, Infomaniak connected as approved, routing rules and audit log, resolve the design question in section 5. Also: (a) automatically strip memory, knowledge-base, chat-history and other built-in tools from any request to a non-local model; (b) a small Open WebUI pipe that presents one assistant (for example Study Buddy) with a per-person setting for which model sits behind it, with a trust check on every switch so a thread that used private material cannot move to a cloud model.</w:t>
             </w:r>
           </w:p>
         </w:tc>
@@ -2730,6 +2730,26 @@
       </w:pPr>
       <w:r>
         <w:t xml:space="preserve">9. Risks</w:t>
+      </w:r>
+    </w:p>
+    <w:p>
+      <w:pPr>
+        <w:pStyle w:val="ListParagraph"/>
+        <w:numPr>
+          <w:ilvl w:val="0"/>
+          <w:numId w:val="2"/>
+        </w:numPr>
+        <w:spacing w:after="60"/>
+      </w:pPr>
+      <w:r>
+        <w:rPr>
+          <w:b/>
+          <w:bCs/>
+        </w:rPr>
+        <w:t xml:space="preserve">Cloud models can pull in private material: </w:t>
+      </w:r>
+      <w:r>
+        <w:t xml:space="preserve">on 10 Oct 2026 a cloud model (Mistral via Infomaniak) used Open WebUI’s built-in memory and knowledge tools on a plain greeting and sent retrieved passages off the Mac. Until the gateway strips these automatically, cloud models stay admin-only with Memory and Builtin Tools switched off per model.</w:t>
       </w:r>
     </w:p>
     <w:p>

</xml_diff>

<commit_message>
Record decision: Infomaniak may receive private data (provisional); per-provider switch
Co-Authored-By: Claude Sonnet 5.5 <noreply@anthropic.com>
Claude-Session: https://claude.ai/code/session_01Qs56CyPwtQAdyeiDNLqDfK
</commit_message>
<xml_diff>
--- a/docs/family-ai-hub-prd.docx
+++ b/docs/family-ai-hub-prd.docx
@@ -19,7 +19,7 @@
           <w:i/>
           <w:iCs/>
         </w:rPr>
-        <w:t xml:space="preserve">Product Requirements Document, draft v0.4</w:t>
+        <w:t xml:space="preserve">Product Requirements Document, draft v0.5</w:t>
       </w:r>
     </w:p>
     <w:p>
@@ -1966,6 +1966,19 @@
         <w:spacing w:after="60"/>
       </w:pPr>
       <w:r>
+        <w:t xml:space="preserve">Each provider has an admin-set switch, may_receive_private_data, recorded with a date. Decision (11 Oct 2026): the owner is comfortable with Infomaniak-hosted models receiving her own memories, knowledge and chats, provisionally until the written terms are read (review by 10 Nov 2026). Other family members are told before their data can reach Infomaniak, and Grace stays on local models unless the admin decides otherwise. Providers not marked approved keep memory, knowledge and tools stripped.</w:t>
+      </w:r>
+    </w:p>
+    <w:p>
+      <w:pPr>
+        <w:pStyle w:val="ListParagraph"/>
+        <w:numPr>
+          <w:ilvl w:val="0"/>
+          <w:numId w:val="2"/>
+        </w:numPr>
+        <w:spacing w:after="60"/>
+      </w:pPr>
+      <w:r>
         <w:t xml:space="preserve">If a request is blocked, the user sees a clear message and a one-click option to switch to a local model. The system never silently falls back to a cloud provider.</w:t>
       </w:r>
     </w:p>
@@ -2749,7 +2762,7 @@
         <w:t xml:space="preserve">Cloud models can pull in private material: </w:t>
       </w:r>
       <w:r>
-        <w:t xml:space="preserve">on 10 Oct 2026 a cloud model (Mistral via Infomaniak) used Open WebUI’s built-in memory and knowledge tools on a plain greeting and sent retrieved passages off the Mac. Until the gateway strips these automatically, cloud models stay admin-only with Memory and Builtin Tools switched off per model.</w:t>
+        <w:t xml:space="preserve">on 10 Oct 2026 a cloud model (Mistral via Infomaniak) used Open WebUI’s built-in memory and knowledge tools on a plain greeting and sent retrieved passages off the Mac. This is now acceptable for Infomaniak (see section 5) but still applies to any provider not marked as allowed to receive private data. Until the safeguard exists, such models stay admin-only with Memory and Builtin Tools switched off per model.</w:t>
       </w:r>
     </w:p>
     <w:p>

</xml_diff>